<commit_message>
feat: complete final rubric audit and gym UI polish (#19)
</commit_message>
<xml_diff>
--- a/deliverables/HeThongQuanLyPhongGym_Report.docx
+++ b/deliverables/HeThongQuanLyPhongGym_Report.docx
@@ -3989,7 +3989,7 @@
     </w:p>
     <w:p>
       <w:r>
-        <w:t>Layout responsive, validation hai lớp, anti-forgery, thông báo lỗi kết nối và health endpoint.</w:t>
+        <w:t>Giao diện responsive theo chủ đề gym, điều hướng theo vai trò, validation hai lớp, anti-forgery, trạng thái tiếng Việt, thông báo lỗi kết nối và health endpoint.</w:t>
       </w:r>
     </w:p>
     <w:p>
@@ -4002,7 +4002,7 @@
     </w:p>
     <w:p>
       <w:r>
-        <w:t>Đối với nội dung ux và xử lý lỗi, nhóm ưu tiên tính nhất quán dữ liệu và khả năng chứng minh trực tiếp trên SQL Server. Layout responsive, validation hai lớp, anti-forgery, thông báo lỗi kết nối và health endpoint. Quyết định được phản ánh đồng thời trong schema, stored procedure, repository và giao diện, tránh để business rule chỉ tồn tại ở một tầng dễ bị bỏ qua.</w:t>
+        <w:t>Đối với nội dung ux và xử lý lỗi, nhóm ưu tiên tính nhất quán dữ liệu và khả năng chứng minh trực tiếp trên SQL Server. Giao diện responsive theo chủ đề gym, điều hướng theo vai trò, validation hai lớp, anti-forgery, trạng thái tiếng Việt, thông báo lỗi kết nối và health endpoint. Quyết định được phản ánh đồng thời trong schema, stored procedure, repository và giao diện, tránh để business rule chỉ tồn tại ở một tầng dễ bị bỏ qua.</w:t>
       </w:r>
     </w:p>
     <w:p>
@@ -4801,7 +4801,7 @@
     </w:tbl>
     <w:p>
       <w:r>
-        <w:t>Concurrency: kết nối B chờ 4.835 giây; kết quả 1 CONFIRMED và 1 WAITLISTED. Index benchmark: logical reads LichLop giảm 18 xuống 3.</w:t>
+        <w:t>Concurrency: kết nối B chờ 4.835 giây; kết quả 1 CONFIRMED và 1 WAITLISTED. Index benchmark mới nhất: logical reads LichLop giảm 16 xuống 6 (62,5%).</w:t>
       </w:r>
     </w:p>
     <w:p>

</xml_diff>